<commit_message>
Them link ma nguon va du lieu
</commit_message>
<xml_diff>
--- a/NOP_BAI/01_BAO_CAO_DO_AN_IT5427.docx
+++ b/NOP_BAI/01_BAO_CAO_DO_AN_IT5427.docx
@@ -265,7 +265,7 @@
     <w:p>
       <w:pPr>
         <w:pStyle w:val="Normal"/>
-        <w:spacing w:before="0" w:after="1100"/>
+        <w:spacing w:before="0" w:after="300"/>
         <w:jc w:val="center"/>
         <w:rPr/>
       </w:pPr>
@@ -277,6 +277,68 @@
         </w:rPr>
         <w:t>Nguyễn Hoàng Quốc – 20261110M</w:t>
       </w:r>
+    </w:p>
+    <w:p>
+      <w:pPr>
+        <w:pStyle w:val="Normal"/>
+        <w:spacing w:before="0" w:after="40"/>
+        <w:jc w:val="center"/>
+        <w:rPr/>
+      </w:pPr>
+      <w:r>
+        <w:rPr>
+          <w:rFonts w:eastAsia="Times New Roman" w:cs="Times New Roman"/>
+          <w:b/>
+          <w:bCs/>
+          <w:sz w:val="22"/>
+          <w:szCs w:val="22"/>
+        </w:rPr>
+        <w:t xml:space="preserve">Mã nguồn: </w:t>
+      </w:r>
+      <w:hyperlink r:id="rId2">
+        <w:r>
+          <w:rPr>
+            <w:rStyle w:val="Hyperlink"/>
+            <w:rFonts w:eastAsia="Times New Roman" w:cs="Times New Roman"/>
+            <w:color w:val="0563C1"/>
+            <w:sz w:val="22"/>
+            <w:szCs w:val="22"/>
+            <w:u w:val="single"/>
+          </w:rPr>
+          <w:t>github.com/hoangductudhbk-hub/Big_Data_2026A</w:t>
+        </w:r>
+      </w:hyperlink>
+    </w:p>
+    <w:p>
+      <w:pPr>
+        <w:pStyle w:val="Normal"/>
+        <w:spacing w:before="0" w:after="800"/>
+        <w:jc w:val="center"/>
+        <w:rPr/>
+      </w:pPr>
+      <w:r>
+        <w:rPr>
+          <w:rFonts w:eastAsia="Times New Roman" w:cs="Times New Roman"/>
+          <w:b/>
+          <w:bCs/>
+          <w:sz w:val="22"/>
+          <w:szCs w:val="22"/>
+        </w:rPr>
+        <w:t xml:space="preserve">Dữ liệu: </w:t>
+      </w:r>
+      <w:hyperlink r:id="rId3">
+        <w:r>
+          <w:rPr>
+            <w:rStyle w:val="Hyperlink"/>
+            <w:rFonts w:eastAsia="Times New Roman" w:cs="Times New Roman"/>
+            <w:color w:val="0563C1"/>
+            <w:sz w:val="22"/>
+            <w:szCs w:val="22"/>
+            <w:u w:val="single"/>
+          </w:rPr>
+          <w:t>Google Drive – dữ liệu gốc NYC 2024</w:t>
+        </w:r>
+      </w:hyperlink>
     </w:p>
     <w:p>
       <w:pPr>
@@ -358,7 +420,7 @@
             </w:rPr>
             <w:fldChar w:fldCharType="separate"/>
           </w:r>
-          <w:hyperlink w:anchor="__RefHeading___Toc2426_4233084081">
+          <w:hyperlink w:anchor="__RefHeading___Toc2458_36157587">
             <w:r>
               <w:rPr>
                 <w:rStyle w:val="IndexLink"/>
@@ -378,7 +440,7 @@
             </w:tabs>
             <w:rPr/>
           </w:pPr>
-          <w:hyperlink w:anchor="__RefHeading___Toc2428_4233084081">
+          <w:hyperlink w:anchor="__RefHeading___Toc2460_36157587">
             <w:r>
               <w:rPr>
                 <w:rStyle w:val="IndexLink"/>
@@ -398,7 +460,7 @@
             </w:tabs>
             <w:rPr/>
           </w:pPr>
-          <w:hyperlink w:anchor="__RefHeading___Toc2430_4233084081">
+          <w:hyperlink w:anchor="__RefHeading___Toc2462_36157587">
             <w:r>
               <w:rPr>
                 <w:rStyle w:val="IndexLink"/>
@@ -418,7 +480,7 @@
             </w:tabs>
             <w:rPr/>
           </w:pPr>
-          <w:hyperlink w:anchor="__RefHeading___Toc2432_4233084081">
+          <w:hyperlink w:anchor="__RefHeading___Toc2464_36157587">
             <w:r>
               <w:rPr>
                 <w:rStyle w:val="IndexLink"/>
@@ -438,7 +500,7 @@
             </w:tabs>
             <w:rPr/>
           </w:pPr>
-          <w:hyperlink w:anchor="__RefHeading___Toc2434_4233084081">
+          <w:hyperlink w:anchor="__RefHeading___Toc2466_36157587">
             <w:r>
               <w:rPr>
                 <w:rStyle w:val="IndexLink"/>
@@ -458,7 +520,7 @@
             </w:tabs>
             <w:rPr/>
           </w:pPr>
-          <w:hyperlink w:anchor="__RefHeading___Toc2436_4233084081">
+          <w:hyperlink w:anchor="__RefHeading___Toc2468_36157587">
             <w:r>
               <w:rPr>
                 <w:rStyle w:val="IndexLink"/>
@@ -478,7 +540,7 @@
             </w:tabs>
             <w:rPr/>
           </w:pPr>
-          <w:hyperlink w:anchor="__RefHeading___Toc2438_4233084081">
+          <w:hyperlink w:anchor="__RefHeading___Toc2470_36157587">
             <w:r>
               <w:rPr>
                 <w:rStyle w:val="IndexLink"/>
@@ -498,7 +560,7 @@
             </w:tabs>
             <w:rPr/>
           </w:pPr>
-          <w:hyperlink w:anchor="__RefHeading___Toc2440_4233084081">
+          <w:hyperlink w:anchor="__RefHeading___Toc2472_36157587">
             <w:r>
               <w:rPr>
                 <w:rStyle w:val="IndexLink"/>
@@ -518,7 +580,7 @@
             </w:tabs>
             <w:rPr/>
           </w:pPr>
-          <w:hyperlink w:anchor="__RefHeading___Toc2442_4233084081">
+          <w:hyperlink w:anchor="__RefHeading___Toc2474_36157587">
             <w:r>
               <w:rPr>
                 <w:rStyle w:val="IndexLink"/>
@@ -538,7 +600,7 @@
             </w:tabs>
             <w:rPr/>
           </w:pPr>
-          <w:hyperlink w:anchor="__RefHeading___Toc2444_4233084081">
+          <w:hyperlink w:anchor="__RefHeading___Toc2476_36157587">
             <w:r>
               <w:rPr>
                 <w:rStyle w:val="IndexLink"/>
@@ -558,7 +620,7 @@
             </w:tabs>
             <w:rPr/>
           </w:pPr>
-          <w:hyperlink w:anchor="__RefHeading___Toc2446_4233084081">
+          <w:hyperlink w:anchor="__RefHeading___Toc2478_36157587">
             <w:r>
               <w:rPr>
                 <w:rStyle w:val="IndexLink"/>
@@ -578,7 +640,7 @@
             </w:tabs>
             <w:rPr/>
           </w:pPr>
-          <w:hyperlink w:anchor="__RefHeading___Toc2448_4233084081">
+          <w:hyperlink w:anchor="__RefHeading___Toc2480_36157587">
             <w:r>
               <w:rPr>
                 <w:rStyle w:val="IndexLink"/>
@@ -598,7 +660,7 @@
             </w:tabs>
             <w:rPr/>
           </w:pPr>
-          <w:hyperlink w:anchor="__RefHeading___Toc2450_4233084081">
+          <w:hyperlink w:anchor="__RefHeading___Toc2482_36157587">
             <w:r>
               <w:rPr>
                 <w:rStyle w:val="IndexLink"/>
@@ -618,7 +680,7 @@
             </w:tabs>
             <w:rPr/>
           </w:pPr>
-          <w:hyperlink w:anchor="__RefHeading___Toc2452_4233084081">
+          <w:hyperlink w:anchor="__RefHeading___Toc2484_36157587">
             <w:r>
               <w:rPr>
                 <w:rStyle w:val="IndexLink"/>
@@ -638,7 +700,7 @@
             </w:tabs>
             <w:rPr/>
           </w:pPr>
-          <w:hyperlink w:anchor="__RefHeading___Toc2454_4233084081">
+          <w:hyperlink w:anchor="__RefHeading___Toc2486_36157587">
             <w:r>
               <w:rPr>
                 <w:rStyle w:val="IndexLink"/>
@@ -658,7 +720,7 @@
             </w:tabs>
             <w:rPr/>
           </w:pPr>
-          <w:hyperlink w:anchor="__RefHeading___Toc2456_4233084081">
+          <w:hyperlink w:anchor="__RefHeading___Toc2488_36157587">
             <w:r>
               <w:rPr>
                 <w:rStyle w:val="IndexLink"/>
@@ -678,7 +740,7 @@
             </w:tabs>
             <w:rPr/>
           </w:pPr>
-          <w:hyperlink w:anchor="__RefHeading___Toc2458_4233084081">
+          <w:hyperlink w:anchor="__RefHeading___Toc2490_36157587">
             <w:r>
               <w:rPr>
                 <w:rStyle w:val="IndexLink"/>
@@ -698,7 +760,7 @@
             </w:tabs>
             <w:rPr/>
           </w:pPr>
-          <w:hyperlink w:anchor="__RefHeading___Toc2460_4233084081">
+          <w:hyperlink w:anchor="__RefHeading___Toc2492_36157587">
             <w:r>
               <w:rPr>
                 <w:rStyle w:val="IndexLink"/>
@@ -718,7 +780,7 @@
             </w:tabs>
             <w:rPr/>
           </w:pPr>
-          <w:hyperlink w:anchor="__RefHeading___Toc2462_4233084081">
+          <w:hyperlink w:anchor="__RefHeading___Toc2494_36157587">
             <w:r>
               <w:rPr>
                 <w:rStyle w:val="IndexLink"/>
@@ -738,7 +800,7 @@
             </w:tabs>
             <w:rPr/>
           </w:pPr>
-          <w:hyperlink w:anchor="__RefHeading___Toc2464_4233084081">
+          <w:hyperlink w:anchor="__RefHeading___Toc2496_36157587">
             <w:r>
               <w:rPr>
                 <w:rStyle w:val="IndexLink"/>
@@ -758,7 +820,7 @@
             </w:tabs>
             <w:rPr/>
           </w:pPr>
-          <w:hyperlink w:anchor="__RefHeading___Toc2466_4233084081">
+          <w:hyperlink w:anchor="__RefHeading___Toc2498_36157587">
             <w:r>
               <w:rPr>
                 <w:rStyle w:val="IndexLink"/>
@@ -778,7 +840,7 @@
             </w:tabs>
             <w:rPr/>
           </w:pPr>
-          <w:hyperlink w:anchor="__RefHeading___Toc2468_4233084081">
+          <w:hyperlink w:anchor="__RefHeading___Toc2500_36157587">
             <w:r>
               <w:rPr>
                 <w:rStyle w:val="IndexLink"/>
@@ -798,7 +860,7 @@
             </w:tabs>
             <w:rPr/>
           </w:pPr>
-          <w:hyperlink w:anchor="__RefHeading___Toc2470_4233084081">
+          <w:hyperlink w:anchor="__RefHeading___Toc2502_36157587">
             <w:r>
               <w:rPr>
                 <w:rStyle w:val="IndexLink"/>
@@ -818,7 +880,7 @@
             </w:tabs>
             <w:rPr/>
           </w:pPr>
-          <w:hyperlink w:anchor="__RefHeading___Toc2472_4233084081">
+          <w:hyperlink w:anchor="__RefHeading___Toc2504_36157587">
             <w:r>
               <w:rPr>
                 <w:rStyle w:val="IndexLink"/>
@@ -838,7 +900,7 @@
             </w:tabs>
             <w:rPr/>
           </w:pPr>
-          <w:hyperlink w:anchor="__RefHeading___Toc2474_4233084081">
+          <w:hyperlink w:anchor="__RefHeading___Toc2506_36157587">
             <w:r>
               <w:rPr>
                 <w:rStyle w:val="IndexLink"/>
@@ -858,7 +920,7 @@
             </w:tabs>
             <w:rPr/>
           </w:pPr>
-          <w:hyperlink w:anchor="__RefHeading___Toc2476_4233084081">
+          <w:hyperlink w:anchor="__RefHeading___Toc2508_36157587">
             <w:r>
               <w:rPr>
                 <w:rStyle w:val="IndexLink"/>
@@ -878,7 +940,7 @@
             </w:tabs>
             <w:rPr/>
           </w:pPr>
-          <w:hyperlink w:anchor="__RefHeading___Toc2478_4233084081">
+          <w:hyperlink w:anchor="__RefHeading___Toc2510_36157587">
             <w:r>
               <w:rPr>
                 <w:rStyle w:val="IndexLink"/>
@@ -898,7 +960,7 @@
             </w:tabs>
             <w:rPr/>
           </w:pPr>
-          <w:hyperlink w:anchor="__RefHeading___Toc2480_4233084081">
+          <w:hyperlink w:anchor="__RefHeading___Toc2512_36157587">
             <w:r>
               <w:rPr>
                 <w:rStyle w:val="IndexLink"/>
@@ -918,7 +980,7 @@
             </w:tabs>
             <w:rPr/>
           </w:pPr>
-          <w:hyperlink w:anchor="__RefHeading___Toc2482_4233084081">
+          <w:hyperlink w:anchor="__RefHeading___Toc2514_36157587">
             <w:r>
               <w:rPr>
                 <w:rStyle w:val="IndexLink"/>
@@ -938,7 +1000,7 @@
             </w:tabs>
             <w:rPr/>
           </w:pPr>
-          <w:hyperlink w:anchor="__RefHeading___Toc2484_4233084081">
+          <w:hyperlink w:anchor="__RefHeading___Toc2516_36157587">
             <w:r>
               <w:rPr>
                 <w:rStyle w:val="IndexLink"/>
@@ -958,7 +1020,7 @@
             </w:tabs>
             <w:rPr/>
           </w:pPr>
-          <w:hyperlink w:anchor="__RefHeading___Toc2486_4233084081">
+          <w:hyperlink w:anchor="__RefHeading___Toc2518_36157587">
             <w:r>
               <w:rPr>
                 <w:rStyle w:val="IndexLink"/>
@@ -978,7 +1040,7 @@
             </w:tabs>
             <w:rPr/>
           </w:pPr>
-          <w:hyperlink w:anchor="__RefHeading___Toc2488_4233084081">
+          <w:hyperlink w:anchor="__RefHeading___Toc2520_36157587">
             <w:r>
               <w:rPr>
                 <w:rStyle w:val="IndexLink"/>
@@ -998,7 +1060,7 @@
             </w:tabs>
             <w:rPr/>
           </w:pPr>
-          <w:hyperlink w:anchor="__RefHeading___Toc2490_4233084081">
+          <w:hyperlink w:anchor="__RefHeading___Toc2522_36157587">
             <w:r>
               <w:rPr>
                 <w:rStyle w:val="IndexLink"/>
@@ -1018,12 +1080,12 @@
             </w:tabs>
             <w:rPr/>
           </w:pPr>
-          <w:hyperlink w:anchor="__RefHeading___Toc2492_4233084081">
+          <w:hyperlink w:anchor="__RefHeading___Toc2524_36157587">
             <w:r>
               <w:rPr>
                 <w:rStyle w:val="IndexLink"/>
               </w:rPr>
-              <w:t>A. Cấu trúc mã nguồn</w:t>
+              <w:t>A. Mã nguồn và dữ liệu</w:t>
               <w:tab/>
               <w:t>25</w:t>
             </w:r>
@@ -1038,12 +1100,32 @@
             </w:tabs>
             <w:rPr/>
           </w:pPr>
-          <w:hyperlink w:anchor="__RefHeading___Toc2494_4233084081">
+          <w:hyperlink w:anchor="__RefHeading___Toc2526_36157587">
             <w:r>
               <w:rPr>
                 <w:rStyle w:val="IndexLink"/>
               </w:rPr>
-              <w:t>B. Các lệnh chính</w:t>
+              <w:t>B. Cấu trúc mã nguồn</w:t>
+              <w:tab/>
+              <w:t>25</w:t>
+            </w:r>
+          </w:hyperlink>
+        </w:p>
+        <w:p>
+          <w:pPr>
+            <w:pStyle w:val="TOC2"/>
+            <w:tabs>
+              <w:tab w:val="clear" w:pos="8788"/>
+              <w:tab w:val="right" w:pos="9070" w:leader="dot"/>
+            </w:tabs>
+            <w:rPr/>
+          </w:pPr>
+          <w:hyperlink w:anchor="__RefHeading___Toc2528_36157587">
+            <w:r>
+              <w:rPr>
+                <w:rStyle w:val="IndexLink"/>
+              </w:rPr>
+              <w:t>C. Các lệnh chính</w:t>
               <w:tab/>
               <w:t>25</w:t>
             </w:r>
@@ -1539,6 +1621,68 @@
         </w:rPr>
         <w:t xml:space="preserve"> Bộ dữ liệu giả lập (mock) chỉ dùng để kiểm thử code và kiểm chứng thuật toán phát hiện bất thường.</w:t>
       </w:r>
+    </w:p>
+    <w:p>
+      <w:pPr>
+        <w:pStyle w:val="Normal"/>
+        <w:spacing w:before="0" w:after="80"/>
+        <w:jc w:val="left"/>
+        <w:rPr/>
+      </w:pPr>
+      <w:r>
+        <w:rPr>
+          <w:rFonts w:eastAsia="Times New Roman" w:cs="Times New Roman"/>
+          <w:b/>
+          <w:bCs/>
+          <w:sz w:val="26"/>
+          <w:szCs w:val="26"/>
+        </w:rPr>
+        <w:t xml:space="preserve">Mã nguồn: </w:t>
+      </w:r>
+      <w:hyperlink r:id="rId4">
+        <w:r>
+          <w:rPr>
+            <w:rStyle w:val="Hyperlink"/>
+            <w:rFonts w:eastAsia="Times New Roman" w:cs="Times New Roman"/>
+            <w:color w:val="0563C1"/>
+            <w:sz w:val="26"/>
+            <w:szCs w:val="26"/>
+            <w:u w:val="single"/>
+          </w:rPr>
+          <w:t>https://github.com/hoangductudhbk-hub/Big_Data_2026A</w:t>
+        </w:r>
+      </w:hyperlink>
+    </w:p>
+    <w:p>
+      <w:pPr>
+        <w:pStyle w:val="Normal"/>
+        <w:spacing w:before="0" w:after="80"/>
+        <w:jc w:val="left"/>
+        <w:rPr/>
+      </w:pPr>
+      <w:r>
+        <w:rPr>
+          <w:rFonts w:eastAsia="Times New Roman" w:cs="Times New Roman"/>
+          <w:b/>
+          <w:bCs/>
+          <w:sz w:val="26"/>
+          <w:szCs w:val="26"/>
+        </w:rPr>
+        <w:t xml:space="preserve">Dữ liệu gốc (1,2 GB): </w:t>
+      </w:r>
+      <w:hyperlink r:id="rId5">
+        <w:r>
+          <w:rPr>
+            <w:rStyle w:val="Hyperlink"/>
+            <w:rFonts w:eastAsia="Times New Roman" w:cs="Times New Roman"/>
+            <w:color w:val="0563C1"/>
+            <w:sz w:val="26"/>
+            <w:szCs w:val="26"/>
+            <w:u w:val="single"/>
+          </w:rPr>
+          <w:t>Google Drive</w:t>
+        </w:r>
+      </w:hyperlink>
       <w:r>
         <w:br w:type="page"/>
       </w:r>
@@ -1548,7 +1692,7 @@
         <w:pStyle w:val="Heading1"/>
         <w:rPr/>
       </w:pPr>
-      <w:bookmarkStart w:id="0" w:name="__RefHeading___Toc2426_4233084081"/>
+      <w:bookmarkStart w:id="0" w:name="__RefHeading___Toc2458_36157587"/>
       <w:bookmarkEnd w:id="0"/>
       <w:r>
         <w:rPr/>
@@ -1560,7 +1704,7 @@
         <w:pStyle w:val="Heading2"/>
         <w:rPr/>
       </w:pPr>
-      <w:bookmarkStart w:id="1" w:name="__RefHeading___Toc2428_4233084081"/>
+      <w:bookmarkStart w:id="1" w:name="__RefHeading___Toc2460_36157587"/>
       <w:bookmarkEnd w:id="1"/>
       <w:r>
         <w:rPr/>
@@ -2117,7 +2261,7 @@
         <w:pStyle w:val="Heading2"/>
         <w:rPr/>
       </w:pPr>
-      <w:bookmarkStart w:id="2" w:name="__RefHeading___Toc2430_4233084081"/>
+      <w:bookmarkStart w:id="2" w:name="__RefHeading___Toc2462_36157587"/>
       <w:bookmarkEnd w:id="2"/>
       <w:r>
         <w:rPr/>
@@ -2642,7 +2786,7 @@
         <w:pStyle w:val="Heading2"/>
         <w:rPr/>
       </w:pPr>
-      <w:bookmarkStart w:id="3" w:name="__RefHeading___Toc2432_4233084081"/>
+      <w:bookmarkStart w:id="3" w:name="__RefHeading___Toc2464_36157587"/>
       <w:bookmarkEnd w:id="3"/>
       <w:r>
         <w:rPr/>
@@ -3608,7 +3752,7 @@
         <w:pStyle w:val="Heading2"/>
         <w:rPr/>
       </w:pPr>
-      <w:bookmarkStart w:id="4" w:name="__RefHeading___Toc2434_4233084081"/>
+      <w:bookmarkStart w:id="4" w:name="__RefHeading___Toc2466_36157587"/>
       <w:bookmarkEnd w:id="4"/>
       <w:r>
         <w:rPr/>
@@ -3965,7 +4109,7 @@
         <w:pStyle w:val="Heading2"/>
         <w:rPr/>
       </w:pPr>
-      <w:bookmarkStart w:id="5" w:name="__RefHeading___Toc2436_4233084081"/>
+      <w:bookmarkStart w:id="5" w:name="__RefHeading___Toc2468_36157587"/>
       <w:bookmarkEnd w:id="5"/>
       <w:r>
         <w:rPr/>
@@ -4050,7 +4194,7 @@
                     </pic:cNvPicPr>
                   </pic:nvPicPr>
                   <pic:blipFill>
-                    <a:blip r:embed="rId2"/>
+                    <a:blip r:embed="rId6"/>
                     <a:stretch>
                       <a:fillRect/>
                     </a:stretch>
@@ -4132,7 +4276,7 @@
         <w:pStyle w:val="Heading1"/>
         <w:rPr/>
       </w:pPr>
-      <w:bookmarkStart w:id="6" w:name="__RefHeading___Toc2438_4233084081"/>
+      <w:bookmarkStart w:id="6" w:name="__RefHeading___Toc2470_36157587"/>
       <w:bookmarkEnd w:id="6"/>
       <w:r>
         <w:rPr/>
@@ -4144,7 +4288,7 @@
         <w:pStyle w:val="Heading2"/>
         <w:rPr/>
       </w:pPr>
-      <w:bookmarkStart w:id="7" w:name="__RefHeading___Toc2440_4233084081"/>
+      <w:bookmarkStart w:id="7" w:name="__RefHeading___Toc2472_36157587"/>
       <w:bookmarkEnd w:id="7"/>
       <w:r>
         <w:rPr/>
@@ -4903,7 +5047,7 @@
         <w:pStyle w:val="Heading2"/>
         <w:rPr/>
       </w:pPr>
-      <w:bookmarkStart w:id="8" w:name="__RefHeading___Toc2442_4233084081"/>
+      <w:bookmarkStart w:id="8" w:name="__RefHeading___Toc2474_36157587"/>
       <w:bookmarkEnd w:id="8"/>
       <w:r>
         <w:rPr/>
@@ -5881,7 +6025,7 @@
         <w:pStyle w:val="Heading2"/>
         <w:rPr/>
       </w:pPr>
-      <w:bookmarkStart w:id="9" w:name="__RefHeading___Toc2444_4233084081"/>
+      <w:bookmarkStart w:id="9" w:name="__RefHeading___Toc2476_36157587"/>
       <w:bookmarkEnd w:id="9"/>
       <w:r>
         <w:rPr/>
@@ -6576,7 +6720,7 @@
         <w:pStyle w:val="Heading2"/>
         <w:rPr/>
       </w:pPr>
-      <w:bookmarkStart w:id="10" w:name="__RefHeading___Toc2446_4233084081"/>
+      <w:bookmarkStart w:id="10" w:name="__RefHeading___Toc2478_36157587"/>
       <w:bookmarkEnd w:id="10"/>
       <w:r>
         <w:rPr/>
@@ -8990,7 +9134,7 @@
         <w:pStyle w:val="Heading2"/>
         <w:rPr/>
       </w:pPr>
-      <w:bookmarkStart w:id="11" w:name="__RefHeading___Toc2448_4233084081"/>
+      <w:bookmarkStart w:id="11" w:name="__RefHeading___Toc2480_36157587"/>
       <w:bookmarkEnd w:id="11"/>
       <w:r>
         <w:rPr/>
@@ -10808,7 +10952,7 @@
         <w:pStyle w:val="Heading2"/>
         <w:rPr/>
       </w:pPr>
-      <w:bookmarkStart w:id="12" w:name="__RefHeading___Toc2450_4233084081"/>
+      <w:bookmarkStart w:id="12" w:name="__RefHeading___Toc2482_36157587"/>
       <w:bookmarkEnd w:id="12"/>
       <w:r>
         <w:rPr/>
@@ -11411,7 +11555,7 @@
         <w:pStyle w:val="Heading1"/>
         <w:rPr/>
       </w:pPr>
-      <w:bookmarkStart w:id="13" w:name="__RefHeading___Toc2452_4233084081"/>
+      <w:bookmarkStart w:id="13" w:name="__RefHeading___Toc2484_36157587"/>
       <w:bookmarkEnd w:id="13"/>
       <w:r>
         <w:rPr/>
@@ -11474,7 +11618,7 @@
         <w:pStyle w:val="Heading2"/>
         <w:rPr/>
       </w:pPr>
-      <w:bookmarkStart w:id="14" w:name="__RefHeading___Toc2454_4233084081"/>
+      <w:bookmarkStart w:id="14" w:name="__RefHeading___Toc2486_36157587"/>
       <w:bookmarkEnd w:id="14"/>
       <w:r>
         <w:rPr/>
@@ -11539,7 +11683,7 @@
         <w:pStyle w:val="Heading2"/>
         <w:rPr/>
       </w:pPr>
-      <w:bookmarkStart w:id="15" w:name="__RefHeading___Toc2456_4233084081"/>
+      <w:bookmarkStart w:id="15" w:name="__RefHeading___Toc2488_36157587"/>
       <w:bookmarkEnd w:id="15"/>
       <w:r>
         <w:rPr/>
@@ -12534,7 +12678,7 @@
         <w:pStyle w:val="Heading2"/>
         <w:rPr/>
       </w:pPr>
-      <w:bookmarkStart w:id="16" w:name="__RefHeading___Toc2458_4233084081"/>
+      <w:bookmarkStart w:id="16" w:name="__RefHeading___Toc2490_36157587"/>
       <w:bookmarkEnd w:id="16"/>
       <w:r>
         <w:rPr/>
@@ -13535,7 +13679,7 @@
         <w:pStyle w:val="Heading2"/>
         <w:rPr/>
       </w:pPr>
-      <w:bookmarkStart w:id="17" w:name="__RefHeading___Toc2460_4233084081"/>
+      <w:bookmarkStart w:id="17" w:name="__RefHeading___Toc2492_36157587"/>
       <w:bookmarkEnd w:id="17"/>
       <w:r>
         <w:rPr/>
@@ -14502,7 +14646,7 @@
                     </pic:cNvPicPr>
                   </pic:nvPicPr>
                   <pic:blipFill>
-                    <a:blip r:embed="rId3"/>
+                    <a:blip r:embed="rId7"/>
                     <a:stretch>
                       <a:fillRect/>
                     </a:stretch>
@@ -14675,7 +14819,7 @@
         <w:pStyle w:val="Heading1"/>
         <w:rPr/>
       </w:pPr>
-      <w:bookmarkStart w:id="18" w:name="__RefHeading___Toc2462_4233084081"/>
+      <w:bookmarkStart w:id="18" w:name="__RefHeading___Toc2494_36157587"/>
       <w:bookmarkEnd w:id="18"/>
       <w:r>
         <w:rPr/>
@@ -14687,7 +14831,7 @@
         <w:pStyle w:val="Heading2"/>
         <w:rPr/>
       </w:pPr>
-      <w:bookmarkStart w:id="19" w:name="__RefHeading___Toc2464_4233084081"/>
+      <w:bookmarkStart w:id="19" w:name="__RefHeading___Toc2496_36157587"/>
       <w:bookmarkEnd w:id="19"/>
       <w:r>
         <w:rPr/>
@@ -15394,7 +15538,7 @@
                     </pic:cNvPicPr>
                   </pic:nvPicPr>
                   <pic:blipFill>
-                    <a:blip r:embed="rId4"/>
+                    <a:blip r:embed="rId8"/>
                     <a:stretch>
                       <a:fillRect/>
                     </a:stretch>
@@ -15536,7 +15680,7 @@
         <w:pStyle w:val="Heading2"/>
         <w:rPr/>
       </w:pPr>
-      <w:bookmarkStart w:id="20" w:name="__RefHeading___Toc2466_4233084081"/>
+      <w:bookmarkStart w:id="20" w:name="__RefHeading___Toc2498_36157587"/>
       <w:bookmarkEnd w:id="20"/>
       <w:r>
         <w:rPr/>
@@ -15668,7 +15812,7 @@
                     </pic:cNvPicPr>
                   </pic:nvPicPr>
                   <pic:blipFill>
-                    <a:blip r:embed="rId5"/>
+                    <a:blip r:embed="rId9"/>
                     <a:stretch>
                       <a:fillRect/>
                     </a:stretch>
@@ -16656,7 +16800,7 @@
         <w:pStyle w:val="Heading2"/>
         <w:rPr/>
       </w:pPr>
-      <w:bookmarkStart w:id="21" w:name="__RefHeading___Toc2468_4233084081"/>
+      <w:bookmarkStart w:id="21" w:name="__RefHeading___Toc2500_36157587"/>
       <w:bookmarkEnd w:id="21"/>
       <w:r>
         <w:rPr/>
@@ -17616,7 +17760,7 @@
                     </pic:cNvPicPr>
                   </pic:nvPicPr>
                   <pic:blipFill>
-                    <a:blip r:embed="rId6"/>
+                    <a:blip r:embed="rId10"/>
                     <a:stretch>
                       <a:fillRect/>
                     </a:stretch>
@@ -18250,7 +18394,7 @@
         <w:pStyle w:val="Heading1"/>
         <w:rPr/>
       </w:pPr>
-      <w:bookmarkStart w:id="22" w:name="__RefHeading___Toc2470_4233084081"/>
+      <w:bookmarkStart w:id="22" w:name="__RefHeading___Toc2502_36157587"/>
       <w:bookmarkEnd w:id="22"/>
       <w:r>
         <w:rPr/>
@@ -18262,7 +18406,7 @@
         <w:pStyle w:val="Heading2"/>
         <w:rPr/>
       </w:pPr>
-      <w:bookmarkStart w:id="23" w:name="__RefHeading___Toc2472_4233084081"/>
+      <w:bookmarkStart w:id="23" w:name="__RefHeading___Toc2504_36157587"/>
       <w:bookmarkEnd w:id="23"/>
       <w:r>
         <w:rPr/>
@@ -19359,7 +19503,7 @@
         <w:pStyle w:val="Heading2"/>
         <w:rPr/>
       </w:pPr>
-      <w:bookmarkStart w:id="24" w:name="__RefHeading___Toc2474_4233084081"/>
+      <w:bookmarkStart w:id="24" w:name="__RefHeading___Toc2506_36157587"/>
       <w:bookmarkEnd w:id="24"/>
       <w:r>
         <w:rPr/>
@@ -20489,7 +20633,7 @@
         <w:pStyle w:val="Heading2"/>
         <w:rPr/>
       </w:pPr>
-      <w:bookmarkStart w:id="25" w:name="__RefHeading___Toc2476_4233084081"/>
+      <w:bookmarkStart w:id="25" w:name="__RefHeading___Toc2508_36157587"/>
       <w:bookmarkEnd w:id="25"/>
       <w:r>
         <w:rPr/>
@@ -20540,7 +20684,7 @@
                     </pic:cNvPicPr>
                   </pic:nvPicPr>
                   <pic:blipFill>
-                    <a:blip r:embed="rId7"/>
+                    <a:blip r:embed="rId11"/>
                     <a:stretch>
                       <a:fillRect/>
                     </a:stretch>
@@ -20606,7 +20750,7 @@
                     </pic:cNvPicPr>
                   </pic:nvPicPr>
                   <pic:blipFill>
-                    <a:blip r:embed="rId8"/>
+                    <a:blip r:embed="rId12"/>
                     <a:stretch>
                       <a:fillRect/>
                     </a:stretch>
@@ -20672,7 +20816,7 @@
                     </pic:cNvPicPr>
                   </pic:nvPicPr>
                   <pic:blipFill>
-                    <a:blip r:embed="rId9"/>
+                    <a:blip r:embed="rId13"/>
                     <a:stretch>
                       <a:fillRect/>
                     </a:stretch>
@@ -20716,7 +20860,7 @@
         <w:pStyle w:val="Heading2"/>
         <w:rPr/>
       </w:pPr>
-      <w:bookmarkStart w:id="26" w:name="__RefHeading___Toc2478_4233084081"/>
+      <w:bookmarkStart w:id="26" w:name="__RefHeading___Toc2510_36157587"/>
       <w:bookmarkEnd w:id="26"/>
       <w:r>
         <w:rPr/>
@@ -21334,7 +21478,7 @@
         <w:pStyle w:val="Heading1"/>
         <w:rPr/>
       </w:pPr>
-      <w:bookmarkStart w:id="27" w:name="__RefHeading___Toc2480_4233084081"/>
+      <w:bookmarkStart w:id="27" w:name="__RefHeading___Toc2512_36157587"/>
       <w:bookmarkEnd w:id="27"/>
       <w:r>
         <w:rPr/>
@@ -21346,7 +21490,7 @@
         <w:pStyle w:val="Heading2"/>
         <w:rPr/>
       </w:pPr>
-      <w:bookmarkStart w:id="28" w:name="__RefHeading___Toc2482_4233084081"/>
+      <w:bookmarkStart w:id="28" w:name="__RefHeading___Toc2514_36157587"/>
       <w:bookmarkEnd w:id="28"/>
       <w:r>
         <w:rPr/>
@@ -23432,7 +23576,7 @@
         <w:pStyle w:val="Heading2"/>
         <w:rPr/>
       </w:pPr>
-      <w:bookmarkStart w:id="29" w:name="__RefHeading___Toc2484_4233084081"/>
+      <w:bookmarkStart w:id="29" w:name="__RefHeading___Toc2516_36157587"/>
       <w:bookmarkEnd w:id="29"/>
       <w:r>
         <w:rPr/>
@@ -24197,7 +24341,7 @@
         <w:pStyle w:val="Heading2"/>
         <w:rPr/>
       </w:pPr>
-      <w:bookmarkStart w:id="30" w:name="__RefHeading___Toc2486_4233084081"/>
+      <w:bookmarkStart w:id="30" w:name="__RefHeading___Toc2518_36157587"/>
       <w:bookmarkEnd w:id="30"/>
       <w:r>
         <w:rPr/>
@@ -24361,7 +24505,7 @@
         <w:pStyle w:val="Heading2"/>
         <w:rPr/>
       </w:pPr>
-      <w:bookmarkStart w:id="31" w:name="__RefHeading___Toc2488_4233084081"/>
+      <w:bookmarkStart w:id="31" w:name="__RefHeading___Toc2520_36157587"/>
       <w:bookmarkEnd w:id="31"/>
       <w:r>
         <w:rPr/>
@@ -24411,7 +24555,7 @@
         <w:pStyle w:val="Heading1"/>
         <w:rPr/>
       </w:pPr>
-      <w:bookmarkStart w:id="32" w:name="__RefHeading___Toc2490_4233084081"/>
+      <w:bookmarkStart w:id="32" w:name="__RefHeading___Toc2522_36157587"/>
       <w:bookmarkEnd w:id="32"/>
       <w:r>
         <w:rPr/>
@@ -24423,11 +24567,182 @@
         <w:pStyle w:val="Heading2"/>
         <w:rPr/>
       </w:pPr>
-      <w:bookmarkStart w:id="33" w:name="__RefHeading___Toc2492_4233084081"/>
+      <w:bookmarkStart w:id="33" w:name="__RefHeading___Toc2524_36157587"/>
       <w:bookmarkEnd w:id="33"/>
       <w:r>
         <w:rPr/>
-        <w:t>A. Cấu trúc mã nguồn</w:t>
+        <w:t>A. Mã nguồn và dữ liệu</w:t>
+      </w:r>
+    </w:p>
+    <w:p>
+      <w:pPr>
+        <w:pStyle w:val="Normal"/>
+        <w:spacing w:before="0" w:after="80"/>
+        <w:jc w:val="left"/>
+        <w:rPr/>
+      </w:pPr>
+      <w:r>
+        <w:rPr>
+          <w:rFonts w:eastAsia="Times New Roman" w:cs="Times New Roman"/>
+          <w:b/>
+          <w:bCs/>
+          <w:sz w:val="26"/>
+          <w:szCs w:val="26"/>
+        </w:rPr>
+        <w:t xml:space="preserve">Mã nguồn (GitHub): </w:t>
+      </w:r>
+      <w:hyperlink r:id="rId14">
+        <w:r>
+          <w:rPr>
+            <w:rStyle w:val="Hyperlink"/>
+            <w:rFonts w:eastAsia="Times New Roman" w:cs="Times New Roman"/>
+            <w:color w:val="0563C1"/>
+            <w:sz w:val="26"/>
+            <w:szCs w:val="26"/>
+            <w:u w:val="single"/>
+          </w:rPr>
+          <w:t>https://github.com/hoangductudhbk-hub/Big_Data_2026A</w:t>
+        </w:r>
+      </w:hyperlink>
+    </w:p>
+    <w:p>
+      <w:pPr>
+        <w:pStyle w:val="Normal"/>
+        <w:spacing w:before="0" w:after="80"/>
+        <w:jc w:val="left"/>
+        <w:rPr/>
+      </w:pPr>
+      <w:r>
+        <w:rPr>
+          <w:rFonts w:eastAsia="Times New Roman" w:cs="Times New Roman"/>
+          <w:b/>
+          <w:bCs/>
+          <w:sz w:val="26"/>
+          <w:szCs w:val="26"/>
+        </w:rPr>
+        <w:t xml:space="preserve">Dữ liệu gốc (Google Drive): </w:t>
+      </w:r>
+      <w:hyperlink r:id="rId15">
+        <w:r>
+          <w:rPr>
+            <w:rStyle w:val="Hyperlink"/>
+            <w:rFonts w:eastAsia="Times New Roman" w:cs="Times New Roman"/>
+            <w:color w:val="0563C1"/>
+            <w:sz w:val="26"/>
+            <w:szCs w:val="26"/>
+            <w:u w:val="single"/>
+          </w:rPr>
+          <w:t>https://drive.google.com/drive/folders/1dQq9kATcZ4wKA_DBr2S8nlsjQdZNfEy-?usp=sharing</w:t>
+        </w:r>
+      </w:hyperlink>
+    </w:p>
+    <w:p>
+      <w:pPr>
+        <w:pStyle w:val="Normal"/>
+        <w:spacing w:lineRule="exact" w:line="312" w:before="0" w:after="120"/>
+        <w:ind w:firstLine="567"/>
+        <w:jc w:val="both"/>
+        <w:rPr/>
+      </w:pPr>
+      <w:r>
+        <w:rPr>
+          <w:rFonts w:eastAsia="Times New Roman" w:cs="Times New Roman"/>
+          <w:sz w:val="26"/>
+          <w:szCs w:val="26"/>
+        </w:rPr>
+        <w:t>Mã nguồn gồm toàn bộ pipeline, tài liệu từng bước (</w:t>
+      </w:r>
+      <w:r>
+        <w:rPr>
+          <w:rFonts w:eastAsia="Consolas" w:cs="Consolas" w:ascii="Consolas" w:hAnsi="Consolas"/>
+          <w:sz w:val="22"/>
+          <w:szCs w:val="22"/>
+        </w:rPr>
+        <w:t>docs/huong-dan/</w:t>
+      </w:r>
+      <w:r>
+        <w:rPr>
+          <w:rFonts w:eastAsia="Times New Roman" w:cs="Times New Roman"/>
+          <w:sz w:val="26"/>
+          <w:szCs w:val="26"/>
+        </w:rPr>
+        <w:t>), báo cáo số liệu (</w:t>
+      </w:r>
+      <w:r>
+        <w:rPr>
+          <w:rFonts w:eastAsia="Consolas" w:cs="Consolas" w:ascii="Consolas" w:hAnsi="Consolas"/>
+          <w:sz w:val="22"/>
+          <w:szCs w:val="22"/>
+        </w:rPr>
+        <w:t>docs/bao-cao/</w:t>
+      </w:r>
+      <w:r>
+        <w:rPr>
+          <w:rFonts w:eastAsia="Times New Roman" w:cs="Times New Roman"/>
+          <w:sz w:val="26"/>
+          <w:szCs w:val="26"/>
+        </w:rPr>
+        <w:t>) và hồ sơ nộp bài (</w:t>
+      </w:r>
+      <w:r>
+        <w:rPr>
+          <w:rFonts w:eastAsia="Consolas" w:cs="Consolas" w:ascii="Consolas" w:hAnsi="Consolas"/>
+          <w:sz w:val="22"/>
+          <w:szCs w:val="22"/>
+        </w:rPr>
+        <w:t>NOP_BAI/</w:t>
+      </w:r>
+      <w:r>
+        <w:rPr>
+          <w:rFonts w:eastAsia="Times New Roman" w:cs="Times New Roman"/>
+          <w:sz w:val="26"/>
+          <w:szCs w:val="26"/>
+        </w:rPr>
+        <w:t xml:space="preserve">). Dữ liệu gốc New York 2024 (khoảng 1,2 GB) không đưa lên Git vì dung lượng lớn; tải từ thư mục Google Drive ở trên và đặt vào thư mục </w:t>
+      </w:r>
+      <w:r>
+        <w:rPr>
+          <w:rFonts w:eastAsia="Consolas" w:cs="Consolas" w:ascii="Consolas" w:hAnsi="Consolas"/>
+          <w:sz w:val="22"/>
+          <w:szCs w:val="22"/>
+        </w:rPr>
+        <w:t>data/raw/</w:t>
+      </w:r>
+      <w:r>
+        <w:rPr>
+          <w:rFonts w:eastAsia="Times New Roman" w:cs="Times New Roman"/>
+          <w:sz w:val="26"/>
+          <w:szCs w:val="26"/>
+        </w:rPr>
+        <w:t xml:space="preserve"> của repo để chạy lại pipeline từ đầu. Có thể tải lại trực tiếp từ nguồn bằng </w:t>
+      </w:r>
+      <w:r>
+        <w:rPr>
+          <w:rFonts w:eastAsia="Consolas" w:cs="Consolas" w:ascii="Consolas" w:hAnsi="Consolas"/>
+          <w:sz w:val="22"/>
+          <w:szCs w:val="22"/>
+        </w:rPr>
+        <w:t>tai_du_lieu.bat</w:t>
+      </w:r>
+      <w:r>
+        <w:rPr>
+          <w:rFonts w:eastAsia="Times New Roman" w:cs="Times New Roman"/>
+          <w:sz w:val="26"/>
+          <w:szCs w:val="26"/>
+        </w:rPr>
+        <w:t>.</w:t>
+      </w:r>
+    </w:p>
+    <w:p>
+      <w:pPr>
+        <w:pStyle w:val="Heading2"/>
+        <w:rPr/>
+      </w:pPr>
+      <w:bookmarkStart w:id="34" w:name="__RefHeading___Toc2526_36157587"/>
+      <w:bookmarkEnd w:id="34"/>
+      <w:r>
+        <w:rPr/>
+        <w:t>B. Cấu trúc mã nguồn</w:t>
       </w:r>
     </w:p>
     <w:tbl>
@@ -24792,7 +25107,7 @@
                 <w:sz w:val="22"/>
                 <w:szCs w:val="22"/>
               </w:rPr>
-              <w:t>Hướng dẫn và giải trình từng bước 01 → 23</w:t>
+              <w:t>Hướng dẫn và giải trình từng bước 00 → 22</w:t>
             </w:r>
           </w:p>
         </w:tc>
@@ -24906,7 +25221,7 @@
                 <w:sz w:val="22"/>
                 <w:szCs w:val="22"/>
               </w:rPr>
-              <w:t>Dữ liệu (dữ liệu gốc 1,2 GB không đưa lên Git)</w:t>
+              <w:t>Dữ liệu (dữ liệu gốc 1,2 GB tải từ Google Drive, mục A)</w:t>
             </w:r>
           </w:p>
         </w:tc>
@@ -24935,11 +25250,11 @@
         <w:pStyle w:val="Heading2"/>
         <w:rPr/>
       </w:pPr>
-      <w:bookmarkStart w:id="34" w:name="__RefHeading___Toc2494_4233084081"/>
-      <w:bookmarkEnd w:id="34"/>
-      <w:r>
-        <w:rPr/>
-        <w:t>B. Các lệnh chính</w:t>
+      <w:bookmarkStart w:id="35" w:name="__RefHeading___Toc2528_36157587"/>
+      <w:bookmarkEnd w:id="35"/>
+      <w:r>
+        <w:rPr/>
+        <w:t>C. Các lệnh chính</w:t>
       </w:r>
     </w:p>
     <w:p>
@@ -25119,8 +25434,8 @@
       </w:r>
     </w:p>
     <w:sectPr>
-      <w:footerReference w:type="even" r:id="rId10"/>
-      <w:footerReference w:type="default" r:id="rId11"/>
+      <w:footerReference w:type="even" r:id="rId16"/>
+      <w:footerReference w:type="default" r:id="rId17"/>
       <w:type w:val="nextPage"/>
       <w:pgSz w:w="11906" w:h="16838"/>
       <w:pgMar w:left="1701" w:right="1134" w:gutter="0" w:header="0" w:top="1134" w:footer="708" w:bottom="1134"/>

</xml_diff>